<commit_message>
Fix cave plan zone dimensions
</commit_message>
<xml_diff>
--- a/postgresql.docx
+++ b/postgresql.docx
@@ -24,6 +24,53 @@
       </w:r>
       <w:r>
         <w:t>V8R9QpLA9ns7Miqz4H59QR5kGUmABGvP</w:t>
+      </w:r>
+    </w:p>
+    <w:p/>
+    <w:p/>
+    <w:p>
+      <w:pPr>
+        <w:rPr>
+          <w:lang w:val="fr-FR"/>
+        </w:rPr>
+      </w:pPr>
+      <w:r>
+        <w:rPr>
+          <w:lang w:val="fr-FR"/>
+        </w:rPr>
+        <w:t>git add .</w:t>
+      </w:r>
+    </w:p>
+    <w:p>
+      <w:pPr>
+        <w:rPr>
+          <w:lang w:val="fr-FR"/>
+        </w:rPr>
+      </w:pPr>
+      <w:r>
+        <w:rPr>
+          <w:lang w:val="fr-FR"/>
+        </w:rPr>
+        <w:t>git commit -m "</w:t>
+      </w:r>
+      <w:proofErr w:type="spellStart"/>
+      <w:r>
+        <w:rPr>
+          <w:lang w:val="fr-FR"/>
+        </w:rPr>
+        <w:t>Improve</w:t>
+      </w:r>
+      <w:proofErr w:type="spellEnd"/>
+      <w:r>
+        <w:rPr>
+          <w:lang w:val="fr-FR"/>
+        </w:rPr>
+        <w:t xml:space="preserve"> cave plan zone dimensions"</w:t>
+      </w:r>
+    </w:p>
+    <w:p>
+      <w:r>
+        <w:t>git push</w:t>
       </w:r>
     </w:p>
     <w:sectPr>
@@ -639,7 +686,6 @@
   <w:style w:type="character" w:default="1" w:styleId="Policepardfaut">
     <w:name w:val="Default Paragraph Font"/>
     <w:uiPriority w:val="1"/>
-    <w:semiHidden/>
     <w:unhideWhenUsed/>
   </w:style>
   <w:style w:type="table" w:default="1" w:styleId="TableauNormal">

</xml_diff>

<commit_message>
Fix seasonal process form and CO2 result
</commit_message>
<xml_diff>
--- a/postgresql.docx
+++ b/postgresql.docx
@@ -19,60 +19,695 @@
     </w:p>
     <w:p/>
     <w:p>
-      <w:r>
-        <w:t xml:space="preserve">Mot de passe: </w:t>
-      </w:r>
-      <w:r>
-        <w:t>V8R9QpLA9ns7Miqz4H59QR5kGUmABGvP</w:t>
+      <w:pPr>
+        <w:rPr>
+          <w:lang w:val="fr-FR"/>
+        </w:rPr>
+      </w:pPr>
+      <w:r>
+        <w:rPr>
+          <w:lang w:val="fr-FR"/>
+        </w:rPr>
+        <w:t>Mot de passe: V8R9QpLA9ns7Miqz4H59QR5kGUmABGvP</w:t>
+      </w:r>
+    </w:p>
+    <w:p>
+      <w:pPr>
+        <w:rPr>
+          <w:lang w:val="fr-FR"/>
+        </w:rPr>
+      </w:pPr>
+    </w:p>
+    <w:p>
+      <w:pPr>
+        <w:rPr>
+          <w:lang w:val="fr-FR"/>
+        </w:rPr>
+      </w:pPr>
+    </w:p>
+    <w:p>
+      <w:pPr>
+        <w:rPr>
+          <w:lang w:val="fr-FR"/>
+        </w:rPr>
+      </w:pPr>
+      <w:r>
+        <w:rPr>
+          <w:lang w:val="fr-FR"/>
+        </w:rPr>
+        <w:t xml:space="preserve">git </w:t>
+      </w:r>
+      <w:proofErr w:type="spellStart"/>
+      <w:r>
+        <w:rPr>
+          <w:lang w:val="fr-FR"/>
+        </w:rPr>
+        <w:t>add</w:t>
+      </w:r>
+      <w:proofErr w:type="spellEnd"/>
+      <w:r>
+        <w:rPr>
+          <w:lang w:val="fr-FR"/>
+        </w:rPr>
+        <w:t xml:space="preserve"> .</w:t>
+      </w:r>
+    </w:p>
+    <w:p>
+      <w:pPr>
+        <w:rPr>
+          <w:lang w:val="fr-FR"/>
+        </w:rPr>
+      </w:pPr>
+      <w:r>
+        <w:rPr>
+          <w:lang w:val="fr-FR"/>
+        </w:rPr>
+        <w:t>git commit -m "</w:t>
+      </w:r>
+      <w:r>
+        <w:rPr>
+          <w:lang w:val="fr-FR"/>
+        </w:rPr>
+        <w:t>Fix</w:t>
+      </w:r>
+      <w:r>
+        <w:rPr>
+          <w:lang w:val="fr-FR"/>
+        </w:rPr>
+        <w:t xml:space="preserve"> cave plan zone dimensions"</w:t>
+      </w:r>
+    </w:p>
+    <w:p>
+      <w:r>
+        <w:t>git push</w:t>
       </w:r>
     </w:p>
     <w:p/>
     <w:p/>
-    <w:p>
-      <w:pPr>
-        <w:rPr>
-          <w:lang w:val="fr-FR"/>
-        </w:rPr>
-      </w:pPr>
-      <w:r>
-        <w:rPr>
-          <w:lang w:val="fr-FR"/>
-        </w:rPr>
-        <w:t>git add .</w:t>
-      </w:r>
-    </w:p>
-    <w:p>
-      <w:pPr>
-        <w:rPr>
-          <w:lang w:val="fr-FR"/>
-        </w:rPr>
-      </w:pPr>
-      <w:r>
-        <w:rPr>
-          <w:lang w:val="fr-FR"/>
-        </w:rPr>
-        <w:t>git commit -m "</w:t>
-      </w:r>
-      <w:proofErr w:type="spellStart"/>
-      <w:r>
-        <w:rPr>
-          <w:lang w:val="fr-FR"/>
-        </w:rPr>
-        <w:t>Improve</w:t>
-      </w:r>
-      <w:proofErr w:type="spellEnd"/>
-      <w:r>
-        <w:rPr>
-          <w:lang w:val="fr-FR"/>
-        </w:rPr>
-        <w:t xml:space="preserve"> cave plan zone dimensions"</w:t>
-      </w:r>
-    </w:p>
-    <w:p>
-      <w:r>
-        <w:t>git push</w:t>
-      </w:r>
-    </w:p>
+    <w:p/>
+    <w:p>
+      <w:pPr>
+        <w:rPr>
+          <w:lang w:val="fr-FR"/>
+        </w:rPr>
+      </w:pPr>
+      <w:r>
+        <w:rPr>
+          <w:lang w:val="fr-FR"/>
+        </w:rPr>
+        <w:t>Je proposerais cette suite, dans l’ordre le plus utile :</w:t>
+      </w:r>
+    </w:p>
+    <w:p>
+      <w:pPr>
+        <w:numPr>
+          <w:ilvl w:val="0"/>
+          <w:numId w:val="1"/>
+        </w:numPr>
+      </w:pPr>
+      <w:proofErr w:type="spellStart"/>
+      <w:r>
+        <w:rPr>
+          <w:b/>
+          <w:bCs/>
+        </w:rPr>
+        <w:t>Comparaison</w:t>
+      </w:r>
+      <w:proofErr w:type="spellEnd"/>
+      <w:r>
+        <w:rPr>
+          <w:b/>
+          <w:bCs/>
+        </w:rPr>
+        <w:t xml:space="preserve"> de simulations</w:t>
+      </w:r>
+      <w:r>
+        <w:t xml:space="preserve"> </w:t>
+      </w:r>
+    </w:p>
+    <w:p>
+      <w:pPr>
+        <w:numPr>
+          <w:ilvl w:val="1"/>
+          <w:numId w:val="1"/>
+        </w:numPr>
+        <w:rPr>
+          <w:lang w:val="fr-FR"/>
+        </w:rPr>
+      </w:pPr>
+      <w:r>
+        <w:rPr>
+          <w:lang w:val="fr-FR"/>
+        </w:rPr>
+        <w:t xml:space="preserve">comparer plusieurs caves ou scénarios ; </w:t>
+      </w:r>
+    </w:p>
+    <w:p>
+      <w:pPr>
+        <w:numPr>
+          <w:ilvl w:val="1"/>
+          <w:numId w:val="1"/>
+        </w:numPr>
+        <w:rPr>
+          <w:lang w:val="fr-FR"/>
+        </w:rPr>
+      </w:pPr>
+      <w:r>
+        <w:rPr>
+          <w:lang w:val="fr-FR"/>
+        </w:rPr>
+        <w:t xml:space="preserve">tableau côte à côte : kWh, CHF, CO₂, ROI ; </w:t>
+      </w:r>
+    </w:p>
+    <w:p>
+      <w:pPr>
+        <w:numPr>
+          <w:ilvl w:val="1"/>
+          <w:numId w:val="1"/>
+        </w:numPr>
+        <w:rPr>
+          <w:lang w:val="fr-FR"/>
+        </w:rPr>
+      </w:pPr>
+      <w:r>
+        <w:rPr>
+          <w:lang w:val="fr-FR"/>
+        </w:rPr>
+        <w:t xml:space="preserve">très utile pour l’aide à la décision. </w:t>
+      </w:r>
+    </w:p>
+    <w:p>
+      <w:pPr>
+        <w:numPr>
+          <w:ilvl w:val="0"/>
+          <w:numId w:val="1"/>
+        </w:numPr>
+      </w:pPr>
+      <w:proofErr w:type="spellStart"/>
+      <w:r>
+        <w:rPr>
+          <w:b/>
+          <w:bCs/>
+        </w:rPr>
+        <w:t>Édition</w:t>
+      </w:r>
+      <w:proofErr w:type="spellEnd"/>
+      <w:r>
+        <w:rPr>
+          <w:b/>
+          <w:bCs/>
+        </w:rPr>
+        <w:t xml:space="preserve"> des </w:t>
+      </w:r>
+      <w:proofErr w:type="spellStart"/>
+      <w:r>
+        <w:rPr>
+          <w:b/>
+          <w:bCs/>
+        </w:rPr>
+        <w:t>parois</w:t>
+      </w:r>
+      <w:proofErr w:type="spellEnd"/>
+      <w:r>
+        <w:t xml:space="preserve"> </w:t>
+      </w:r>
+    </w:p>
+    <w:p>
+      <w:pPr>
+        <w:numPr>
+          <w:ilvl w:val="1"/>
+          <w:numId w:val="1"/>
+        </w:numPr>
+        <w:rPr>
+          <w:lang w:val="fr-FR"/>
+        </w:rPr>
+      </w:pPr>
+      <w:r>
+        <w:rPr>
+          <w:lang w:val="fr-FR"/>
+        </w:rPr>
+        <w:t xml:space="preserve">modifier matériau, valeur U, surface, épaisseur après création ; </w:t>
+      </w:r>
+    </w:p>
+    <w:p>
+      <w:pPr>
+        <w:numPr>
+          <w:ilvl w:val="1"/>
+          <w:numId w:val="1"/>
+        </w:numPr>
+        <w:rPr>
+          <w:lang w:val="fr-FR"/>
+        </w:rPr>
+      </w:pPr>
+      <w:r>
+        <w:rPr>
+          <w:lang w:val="fr-FR"/>
+        </w:rPr>
+        <w:t xml:space="preserve">aujourd’hui les parois sont surtout définies à la création. </w:t>
+      </w:r>
+    </w:p>
+    <w:p>
+      <w:pPr>
+        <w:numPr>
+          <w:ilvl w:val="0"/>
+          <w:numId w:val="1"/>
+        </w:numPr>
+      </w:pPr>
+      <w:proofErr w:type="spellStart"/>
+      <w:r>
+        <w:rPr>
+          <w:b/>
+          <w:bCs/>
+        </w:rPr>
+        <w:t>Scénarios</w:t>
+      </w:r>
+      <w:proofErr w:type="spellEnd"/>
+      <w:r>
+        <w:rPr>
+          <w:b/>
+          <w:bCs/>
+        </w:rPr>
+        <w:t xml:space="preserve"> </w:t>
+      </w:r>
+      <w:proofErr w:type="spellStart"/>
+      <w:r>
+        <w:rPr>
+          <w:b/>
+          <w:bCs/>
+        </w:rPr>
+        <w:t>sauvegardés</w:t>
+      </w:r>
+      <w:proofErr w:type="spellEnd"/>
+      <w:r>
+        <w:rPr>
+          <w:b/>
+          <w:bCs/>
+        </w:rPr>
+        <w:t xml:space="preserve"> </w:t>
+      </w:r>
+      <w:proofErr w:type="spellStart"/>
+      <w:r>
+        <w:rPr>
+          <w:b/>
+          <w:bCs/>
+        </w:rPr>
+        <w:t>en</w:t>
+      </w:r>
+      <w:proofErr w:type="spellEnd"/>
+      <w:r>
+        <w:rPr>
+          <w:b/>
+          <w:bCs/>
+        </w:rPr>
+        <w:t xml:space="preserve"> base</w:t>
+      </w:r>
+      <w:r>
+        <w:t xml:space="preserve"> </w:t>
+      </w:r>
+    </w:p>
+    <w:p>
+      <w:pPr>
+        <w:numPr>
+          <w:ilvl w:val="1"/>
+          <w:numId w:val="1"/>
+        </w:numPr>
+      </w:pPr>
+      <w:r>
+        <w:t xml:space="preserve">conserver les </w:t>
+      </w:r>
+      <w:proofErr w:type="spellStart"/>
+      <w:r>
+        <w:t>scénarios</w:t>
+      </w:r>
+      <w:proofErr w:type="spellEnd"/>
+      <w:r>
+        <w:t xml:space="preserve"> </w:t>
+      </w:r>
+      <w:proofErr w:type="spellStart"/>
+      <w:r>
+        <w:t>personnalisés</w:t>
+      </w:r>
+      <w:proofErr w:type="spellEnd"/>
+      <w:r>
+        <w:t xml:space="preserve"> ; </w:t>
+      </w:r>
+    </w:p>
+    <w:p>
+      <w:pPr>
+        <w:numPr>
+          <w:ilvl w:val="1"/>
+          <w:numId w:val="1"/>
+        </w:numPr>
+      </w:pPr>
+      <w:proofErr w:type="spellStart"/>
+      <w:r>
+        <w:t>historique</w:t>
+      </w:r>
+      <w:proofErr w:type="spellEnd"/>
+      <w:r>
+        <w:t xml:space="preserve"> avant/après ; </w:t>
+      </w:r>
+    </w:p>
+    <w:p>
+      <w:pPr>
+        <w:numPr>
+          <w:ilvl w:val="1"/>
+          <w:numId w:val="1"/>
+        </w:numPr>
+        <w:rPr>
+          <w:lang w:val="fr-FR"/>
+        </w:rPr>
+      </w:pPr>
+      <w:r>
+        <w:rPr>
+          <w:lang w:val="fr-FR"/>
+        </w:rPr>
+        <w:t xml:space="preserve">export PDF avec scénario choisi. </w:t>
+      </w:r>
+    </w:p>
+    <w:p>
+      <w:pPr>
+        <w:numPr>
+          <w:ilvl w:val="0"/>
+          <w:numId w:val="1"/>
+        </w:numPr>
+      </w:pPr>
+      <w:proofErr w:type="spellStart"/>
+      <w:r>
+        <w:rPr>
+          <w:b/>
+          <w:bCs/>
+        </w:rPr>
+        <w:t>Météo</w:t>
+      </w:r>
+      <w:proofErr w:type="spellEnd"/>
+      <w:r>
+        <w:rPr>
+          <w:b/>
+          <w:bCs/>
+        </w:rPr>
+        <w:t xml:space="preserve"> plus </w:t>
+      </w:r>
+      <w:proofErr w:type="spellStart"/>
+      <w:r>
+        <w:rPr>
+          <w:b/>
+          <w:bCs/>
+        </w:rPr>
+        <w:t>réaliste</w:t>
+      </w:r>
+      <w:proofErr w:type="spellEnd"/>
+      <w:r>
+        <w:t xml:space="preserve"> </w:t>
+      </w:r>
+    </w:p>
+    <w:p>
+      <w:pPr>
+        <w:numPr>
+          <w:ilvl w:val="1"/>
+          <w:numId w:val="1"/>
+        </w:numPr>
+        <w:rPr>
+          <w:lang w:val="fr-FR"/>
+        </w:rPr>
+      </w:pPr>
+      <w:r>
+        <w:rPr>
+          <w:lang w:val="fr-FR"/>
+        </w:rPr>
+        <w:t xml:space="preserve">Vaud, Genève, Valais, Tessin, Alpes, etc. ; </w:t>
+      </w:r>
+    </w:p>
+    <w:p>
+      <w:pPr>
+        <w:numPr>
+          <w:ilvl w:val="1"/>
+          <w:numId w:val="1"/>
+        </w:numPr>
+        <w:rPr>
+          <w:lang w:val="fr-FR"/>
+        </w:rPr>
+      </w:pPr>
+      <w:r>
+        <w:rPr>
+          <w:lang w:val="fr-FR"/>
+        </w:rPr>
+        <w:t xml:space="preserve">éventuellement API Open-Meteo ou données MeteoSwiss plus tard. </w:t>
+      </w:r>
+    </w:p>
+    <w:p>
+      <w:pPr>
+        <w:numPr>
+          <w:ilvl w:val="0"/>
+          <w:numId w:val="1"/>
+        </w:numPr>
+      </w:pPr>
+      <w:proofErr w:type="spellStart"/>
+      <w:r>
+        <w:rPr>
+          <w:b/>
+          <w:bCs/>
+        </w:rPr>
+        <w:t>Amélioration</w:t>
+      </w:r>
+      <w:proofErr w:type="spellEnd"/>
+      <w:r>
+        <w:rPr>
+          <w:b/>
+          <w:bCs/>
+        </w:rPr>
+        <w:t xml:space="preserve"> du plan 2D</w:t>
+      </w:r>
+      <w:r>
+        <w:t xml:space="preserve"> </w:t>
+      </w:r>
+    </w:p>
+    <w:p>
+      <w:pPr>
+        <w:numPr>
+          <w:ilvl w:val="1"/>
+          <w:numId w:val="1"/>
+        </w:numPr>
+      </w:pPr>
+      <w:r>
+        <w:lastRenderedPageBreak/>
+        <w:t xml:space="preserve">couleurs </w:t>
+      </w:r>
+      <w:proofErr w:type="spellStart"/>
+      <w:r>
+        <w:t>selon</w:t>
+      </w:r>
+      <w:proofErr w:type="spellEnd"/>
+      <w:r>
+        <w:t xml:space="preserve"> </w:t>
+      </w:r>
+      <w:proofErr w:type="spellStart"/>
+      <w:r>
+        <w:t>température</w:t>
+      </w:r>
+      <w:proofErr w:type="spellEnd"/>
+      <w:r>
+        <w:t xml:space="preserve"> ; </w:t>
+      </w:r>
+    </w:p>
+    <w:p>
+      <w:pPr>
+        <w:numPr>
+          <w:ilvl w:val="1"/>
+          <w:numId w:val="1"/>
+        </w:numPr>
+      </w:pPr>
+      <w:proofErr w:type="spellStart"/>
+      <w:r>
+        <w:t>légende</w:t>
+      </w:r>
+      <w:proofErr w:type="spellEnd"/>
+      <w:r>
+        <w:t xml:space="preserve"> ; </w:t>
+      </w:r>
+    </w:p>
+    <w:p>
+      <w:pPr>
+        <w:numPr>
+          <w:ilvl w:val="1"/>
+          <w:numId w:val="1"/>
+        </w:numPr>
+      </w:pPr>
+      <w:r>
+        <w:t xml:space="preserve">export image/PDF ; </w:t>
+      </w:r>
+    </w:p>
+    <w:p>
+      <w:pPr>
+        <w:numPr>
+          <w:ilvl w:val="1"/>
+          <w:numId w:val="1"/>
+        </w:numPr>
+      </w:pPr>
+      <w:r>
+        <w:t xml:space="preserve">zones </w:t>
+      </w:r>
+      <w:proofErr w:type="spellStart"/>
+      <w:r>
+        <w:t>cliquables</w:t>
+      </w:r>
+      <w:proofErr w:type="spellEnd"/>
+      <w:r>
+        <w:t xml:space="preserve">. </w:t>
+      </w:r>
+    </w:p>
+    <w:p>
+      <w:pPr>
+        <w:numPr>
+          <w:ilvl w:val="0"/>
+          <w:numId w:val="1"/>
+        </w:numPr>
+      </w:pPr>
+      <w:r>
+        <w:rPr>
+          <w:b/>
+          <w:bCs/>
+        </w:rPr>
+        <w:t xml:space="preserve">Dashboard </w:t>
+      </w:r>
+      <w:proofErr w:type="spellStart"/>
+      <w:r>
+        <w:rPr>
+          <w:b/>
+          <w:bCs/>
+        </w:rPr>
+        <w:t>d’accueil</w:t>
+      </w:r>
+      <w:proofErr w:type="spellEnd"/>
+      <w:r>
+        <w:t xml:space="preserve"> </w:t>
+      </w:r>
+    </w:p>
+    <w:p>
+      <w:pPr>
+        <w:numPr>
+          <w:ilvl w:val="1"/>
+          <w:numId w:val="1"/>
+        </w:numPr>
+      </w:pPr>
+      <w:proofErr w:type="spellStart"/>
+      <w:r>
+        <w:t>nombre</w:t>
+      </w:r>
+      <w:proofErr w:type="spellEnd"/>
+      <w:r>
+        <w:t xml:space="preserve"> de caves ; </w:t>
+      </w:r>
+    </w:p>
+    <w:p>
+      <w:pPr>
+        <w:numPr>
+          <w:ilvl w:val="1"/>
+          <w:numId w:val="1"/>
+        </w:numPr>
+      </w:pPr>
+      <w:proofErr w:type="spellStart"/>
+      <w:r>
+        <w:t>énergie</w:t>
+      </w:r>
+      <w:proofErr w:type="spellEnd"/>
+      <w:r>
+        <w:t xml:space="preserve"> </w:t>
+      </w:r>
+      <w:proofErr w:type="spellStart"/>
+      <w:r>
+        <w:t>totale</w:t>
+      </w:r>
+      <w:proofErr w:type="spellEnd"/>
+      <w:r>
+        <w:t xml:space="preserve"> ; </w:t>
+      </w:r>
+    </w:p>
+    <w:p>
+      <w:pPr>
+        <w:numPr>
+          <w:ilvl w:val="1"/>
+          <w:numId w:val="1"/>
+        </w:numPr>
+      </w:pPr>
+      <w:r>
+        <w:t xml:space="preserve">CO₂ total ; </w:t>
+      </w:r>
+    </w:p>
+    <w:p>
+      <w:pPr>
+        <w:numPr>
+          <w:ilvl w:val="1"/>
+          <w:numId w:val="1"/>
+        </w:numPr>
+      </w:pPr>
+      <w:proofErr w:type="spellStart"/>
+      <w:r>
+        <w:t>économies</w:t>
+      </w:r>
+      <w:proofErr w:type="spellEnd"/>
+      <w:r>
+        <w:t xml:space="preserve"> </w:t>
+      </w:r>
+      <w:proofErr w:type="spellStart"/>
+      <w:r>
+        <w:t>potentielles</w:t>
+      </w:r>
+      <w:proofErr w:type="spellEnd"/>
+      <w:r>
+        <w:t xml:space="preserve">. </w:t>
+      </w:r>
+    </w:p>
+    <w:p>
+      <w:r>
+        <w:rPr>
+          <w:lang w:val="fr-FR"/>
+        </w:rPr>
+        <w:t xml:space="preserve">Je commencerais par </w:t>
+      </w:r>
+      <w:r>
+        <w:rPr>
+          <w:b/>
+          <w:bCs/>
+          <w:lang w:val="fr-FR"/>
+        </w:rPr>
+        <w:t>l’édition des parois</w:t>
+      </w:r>
+      <w:r>
+        <w:rPr>
+          <w:lang w:val="fr-FR"/>
+        </w:rPr>
+        <w:t xml:space="preserve">, car c’est indispensable pour fiabiliser les simulations. </w:t>
+      </w:r>
+      <w:proofErr w:type="spellStart"/>
+      <w:r>
+        <w:t>Puis</w:t>
+      </w:r>
+      <w:proofErr w:type="spellEnd"/>
+      <w:r>
+        <w:t xml:space="preserve"> ensuite </w:t>
+      </w:r>
+      <w:proofErr w:type="spellStart"/>
+      <w:r>
+        <w:rPr>
+          <w:b/>
+          <w:bCs/>
+        </w:rPr>
+        <w:t>comparaison</w:t>
+      </w:r>
+      <w:proofErr w:type="spellEnd"/>
+      <w:r>
+        <w:rPr>
+          <w:b/>
+          <w:bCs/>
+        </w:rPr>
+        <w:t xml:space="preserve"> de simulations</w:t>
+      </w:r>
+      <w:r>
+        <w:t>.</w:t>
+      </w:r>
+    </w:p>
+    <w:p/>
     <w:sectPr>
       <w:pgSz w:w="11906" w:h="16838"/>
       <w:pgMar w:top="1440" w:right="1440" w:bottom="1440" w:left="1440" w:header="708" w:footer="708" w:gutter="0"/>
@@ -81,6 +716,131 @@
     </w:sectPr>
   </w:body>
 </w:document>
+</file>
+
+<file path=word/numbering.xml><?xml version="1.0" encoding="utf-8"?>
+<w:numbering xmlns:wpc="http://schemas.microsoft.com/office/word/2010/wordprocessingCanvas" xmlns:cx="http://schemas.microsoft.com/office/drawing/2014/chartex" xmlns:cx1="http://schemas.microsoft.com/office/drawing/2015/9/8/chartex" xmlns:cx2="http://schemas.microsoft.com/office/drawing/2015/10/21/chartex" xmlns:cx3="http://schemas.microsoft.com/office/drawing/2016/5/9/chartex" xmlns:cx4="http://schemas.microsoft.com/office/drawing/2016/5/10/chartex" xmlns:cx5="http://schemas.microsoft.com/office/drawing/2016/5/11/chartex" xmlns:cx6="http://schemas.microsoft.com/office/drawing/2016/5/12/chartex" xmlns:cx7="http://schemas.microsoft.com/office/drawing/2016/5/13/chartex" xmlns:cx8="http://schemas.microsoft.com/office/drawing/2016/5/14/chartex" xmlns:mc="http://schemas.openxmlformats.org/markup-compatibility/2006" xmlns:aink="http://schemas.microsoft.com/office/drawing/2016/ink" xmlns:am3d="http://schemas.microsoft.com/office/drawing/2017/model3d" xmlns:o="urn:schemas-microsoft-com:office:office" xmlns:oel="http://schemas.microsoft.com/office/2019/extlst" xmlns:r="http://schemas.openxmlformats.org/officeDocument/2006/relationships" xmlns:m="http://schemas.openxmlformats.org/officeDocument/2006/math" xmlns:v="urn:schemas-microsoft-com:vml" xmlns:wp14="http://schemas.microsoft.com/office/word/2010/wordprocessingDrawing" xmlns:wp="http://schemas.openxmlformats.org/drawingml/2006/wordprocessingDrawing" xmlns:w10="urn:schemas-microsoft-com:office:word" xmlns:w="http://schemas.openxmlformats.org/wordprocessingml/2006/main" xmlns:w14="http://schemas.microsoft.com/office/word/2010/wordml" xmlns:w15="http://schemas.microsoft.com/office/word/2012/wordml" xmlns:w16cex="http://schemas.microsoft.com/office/word/2018/wordml/cex" xmlns:w16cid="http://schemas.microsoft.com/office/word/2016/wordml/cid" xmlns:w16="http://schemas.microsoft.com/office/word/2018/wordml" xmlns:w16du="http://schemas.microsoft.com/office/word/2023/wordml/word16du" xmlns:w16sdtdh="http://schemas.microsoft.com/office/word/2020/wordml/sdtdatahash" xmlns:w16sdtfl="http://schemas.microsoft.com/office/word/2024/wordml/sdtformatlock" xmlns:w16se="http://schemas.microsoft.com/office/word/2015/wordml/symex" xmlns:wpg="http://schemas.microsoft.com/office/word/2010/wordprocessingGroup" xmlns:wpi="http://schemas.microsoft.com/office/word/2010/wordprocessingInk" xmlns:wne="http://schemas.microsoft.com/office/word/2006/wordml" xmlns:wps="http://schemas.microsoft.com/office/word/2010/wordprocessingShape" mc:Ignorable="w14 w15 w16se w16cid w16 w16cex w16sdtdh w16sdtfl w16du wp14">
+  <w:abstractNum w:abstractNumId="0" w15:restartNumberingAfterBreak="0">
+    <w:nsid w:val="2A4B2CEC"/>
+    <w:multiLevelType w:val="multilevel"/>
+    <w:tmpl w:val="4154BD76"/>
+    <w:lvl w:ilvl="0">
+      <w:start w:val="1"/>
+      <w:numFmt w:val="decimal"/>
+      <w:lvlText w:val="%1."/>
+      <w:lvlJc w:val="left"/>
+      <w:pPr>
+        <w:tabs>
+          <w:tab w:val="num" w:pos="720"/>
+        </w:tabs>
+        <w:ind w:left="720" w:hanging="360"/>
+      </w:pPr>
+    </w:lvl>
+    <w:lvl w:ilvl="1">
+      <w:start w:val="1"/>
+      <w:numFmt w:val="bullet"/>
+      <w:lvlText w:val="o"/>
+      <w:lvlJc w:val="left"/>
+      <w:pPr>
+        <w:tabs>
+          <w:tab w:val="num" w:pos="1440"/>
+        </w:tabs>
+        <w:ind w:left="1440" w:hanging="360"/>
+      </w:pPr>
+      <w:rPr>
+        <w:rFonts w:ascii="Courier New" w:hAnsi="Courier New" w:hint="default"/>
+        <w:sz w:val="20"/>
+      </w:rPr>
+    </w:lvl>
+    <w:lvl w:ilvl="2" w:tentative="1">
+      <w:start w:val="1"/>
+      <w:numFmt w:val="decimal"/>
+      <w:lvlText w:val="%3."/>
+      <w:lvlJc w:val="left"/>
+      <w:pPr>
+        <w:tabs>
+          <w:tab w:val="num" w:pos="2160"/>
+        </w:tabs>
+        <w:ind w:left="2160" w:hanging="360"/>
+      </w:pPr>
+    </w:lvl>
+    <w:lvl w:ilvl="3" w:tentative="1">
+      <w:start w:val="1"/>
+      <w:numFmt w:val="decimal"/>
+      <w:lvlText w:val="%4."/>
+      <w:lvlJc w:val="left"/>
+      <w:pPr>
+        <w:tabs>
+          <w:tab w:val="num" w:pos="2880"/>
+        </w:tabs>
+        <w:ind w:left="2880" w:hanging="360"/>
+      </w:pPr>
+    </w:lvl>
+    <w:lvl w:ilvl="4" w:tentative="1">
+      <w:start w:val="1"/>
+      <w:numFmt w:val="decimal"/>
+      <w:lvlText w:val="%5."/>
+      <w:lvlJc w:val="left"/>
+      <w:pPr>
+        <w:tabs>
+          <w:tab w:val="num" w:pos="3600"/>
+        </w:tabs>
+        <w:ind w:left="3600" w:hanging="360"/>
+      </w:pPr>
+    </w:lvl>
+    <w:lvl w:ilvl="5" w:tentative="1">
+      <w:start w:val="1"/>
+      <w:numFmt w:val="decimal"/>
+      <w:lvlText w:val="%6."/>
+      <w:lvlJc w:val="left"/>
+      <w:pPr>
+        <w:tabs>
+          <w:tab w:val="num" w:pos="4320"/>
+        </w:tabs>
+        <w:ind w:left="4320" w:hanging="360"/>
+      </w:pPr>
+    </w:lvl>
+    <w:lvl w:ilvl="6" w:tentative="1">
+      <w:start w:val="1"/>
+      <w:numFmt w:val="decimal"/>
+      <w:lvlText w:val="%7."/>
+      <w:lvlJc w:val="left"/>
+      <w:pPr>
+        <w:tabs>
+          <w:tab w:val="num" w:pos="5040"/>
+        </w:tabs>
+        <w:ind w:left="5040" w:hanging="360"/>
+      </w:pPr>
+    </w:lvl>
+    <w:lvl w:ilvl="7" w:tentative="1">
+      <w:start w:val="1"/>
+      <w:numFmt w:val="decimal"/>
+      <w:lvlText w:val="%8."/>
+      <w:lvlJc w:val="left"/>
+      <w:pPr>
+        <w:tabs>
+          <w:tab w:val="num" w:pos="5760"/>
+        </w:tabs>
+        <w:ind w:left="5760" w:hanging="360"/>
+      </w:pPr>
+    </w:lvl>
+    <w:lvl w:ilvl="8" w:tentative="1">
+      <w:start w:val="1"/>
+      <w:numFmt w:val="decimal"/>
+      <w:lvlText w:val="%9."/>
+      <w:lvlJc w:val="left"/>
+      <w:pPr>
+        <w:tabs>
+          <w:tab w:val="num" w:pos="6480"/>
+        </w:tabs>
+        <w:ind w:left="6480" w:hanging="360"/>
+      </w:pPr>
+    </w:lvl>
+  </w:abstractNum>
+  <w:num w:numId="1" w16cid:durableId="1992908360">
+    <w:abstractNumId w:val="0"/>
+  </w:num>
+</w:numbering>
 </file>
 
 <file path=word/styles.xml><?xml version="1.0" encoding="utf-8"?>

</xml_diff>